<commit_message>
feat(auth): renovar la sesión mientras el usuario trabaja
US-17, criterio 4 (decisión D11): el token dura 30 minutos y la web lo
renueva con POST /api/auth/renovar mientras hay actividad; sin peticiones
durante 30 minutos vence. Una cuenta desactivada no puede renovar. El
criterio no tenía prueba: ahora la tienen la expiración y la renovación.

Se registran también las decisiones D10 (RUDE único por gestión) y D11
en reglas-ministerio.md y en el acta de conformidad para el cliente.

Refs: US-17, T-010
</commit_message>
<xml_diff>
--- a/docs/actas/conformidad-reglas-calculo.docx
+++ b/docs/actas/conformidad-reglas-calculo.docx
@@ -2559,6 +2559,144 @@
           </w:p>
         </w:tc>
       </w:tr>
+      <w:tr>
+        <w:trPr>
+          <w:cantSplit/>
+        </w:trPr>
+        <w:tc>
+          <w:tcPr>
+            <w:tcW w:type="dxa" w:w="567"/>
+          </w:tcPr>
+          <w:p>
+            <w:r>
+              <w:rPr>
+                <w:sz w:val="18"/>
+              </w:rPr>
+              <w:t>D10</w:t>
+            </w:r>
+          </w:p>
+        </w:tc>
+        <w:tc>
+          <w:tcPr>
+            <w:tcW w:type="dxa" w:w="3402"/>
+          </w:tcPr>
+          <w:p>
+            <w:r>
+              <w:rPr>
+                <w:sz w:val="18"/>
+              </w:rPr>
+              <w:t>¿Cómo se sabe que un estudiante ya está inscrito en la gestión?</w:t>
+            </w:r>
+          </w:p>
+        </w:tc>
+        <w:tc>
+          <w:tcPr>
+            <w:tcW w:type="dxa" w:w="5669"/>
+          </w:tcPr>
+          <w:p>
+            <w:r>
+              <w:rPr>
+                <w:sz w:val="18"/>
+              </w:rPr>
+              <w:t>Por su código RUDE (Registro Único de Estudiantes): no se repite en una gestión; en otra gestión vuelve a inscribirse.</w:t>
+            </w:r>
+          </w:p>
+        </w:tc>
+        <w:tc>
+          <w:tcPr>
+            <w:tcW w:type="dxa" w:w="1134"/>
+          </w:tcPr>
+          <w:p>
+            <w:r>
+              <w:rPr>
+                <w:sz w:val="18"/>
+              </w:rPr>
+              <w:t>☐</w:t>
+            </w:r>
+          </w:p>
+        </w:tc>
+        <w:tc>
+          <w:tcPr>
+            <w:tcW w:type="dxa" w:w="3118"/>
+          </w:tcPr>
+          <w:p>
+            <w:r>
+              <w:rPr>
+                <w:sz w:val="18"/>
+              </w:rPr>
+            </w:r>
+          </w:p>
+        </w:tc>
+      </w:tr>
+      <w:tr>
+        <w:trPr>
+          <w:cantSplit/>
+        </w:trPr>
+        <w:tc>
+          <w:tcPr>
+            <w:tcW w:type="dxa" w:w="567"/>
+          </w:tcPr>
+          <w:p>
+            <w:r>
+              <w:rPr>
+                <w:sz w:val="18"/>
+              </w:rPr>
+              <w:t>D11</w:t>
+            </w:r>
+          </w:p>
+        </w:tc>
+        <w:tc>
+          <w:tcPr>
+            <w:tcW w:type="dxa" w:w="3402"/>
+          </w:tcPr>
+          <w:p>
+            <w:r>
+              <w:rPr>
+                <w:sz w:val="18"/>
+              </w:rPr>
+              <w:t>¿Qué es "30 minutos sin actividad" en la sesión?</w:t>
+            </w:r>
+          </w:p>
+        </w:tc>
+        <w:tc>
+          <w:tcPr>
+            <w:tcW w:type="dxa" w:w="5669"/>
+          </w:tcPr>
+          <w:p>
+            <w:r>
+              <w:rPr>
+                <w:sz w:val="18"/>
+              </w:rPr>
+              <w:t>El token dura 30 minutos y la web lo renueva (POST /api/auth/renovar) mientras el usuario trabaja; sin peticiones durante 30 minutos, vence.</w:t>
+            </w:r>
+          </w:p>
+        </w:tc>
+        <w:tc>
+          <w:tcPr>
+            <w:tcW w:type="dxa" w:w="1134"/>
+          </w:tcPr>
+          <w:p>
+            <w:r>
+              <w:rPr>
+                <w:sz w:val="18"/>
+              </w:rPr>
+              <w:t>☐</w:t>
+            </w:r>
+          </w:p>
+        </w:tc>
+        <w:tc>
+          <w:tcPr>
+            <w:tcW w:type="dxa" w:w="3118"/>
+          </w:tcPr>
+          <w:p>
+            <w:r>
+              <w:rPr>
+                <w:sz w:val="18"/>
+              </w:rPr>
+            </w:r>
+          </w:p>
+        </w:tc>
+      </w:tr>
     </w:tbl>
     <w:p/>
     <w:p>

</xml_diff>

<commit_message>
test(calculo): ampliar la tabla de casos de M01 de 5 a 13 casos frontera
Riesgo R02: casos de D1 (actividad no presentada con 1) y D2 (redondeo
0,5 hacia arriba solo al final: 50,45 da 50, por dimensión daría 51),
frontera 50,55 y 99,5, nota exacta 51 y promedios con decimales. Los
valores esperados se calcularon aparte con aritmética decimal. El acta
de conformidad se regenera con el cliente piloto (Unidad Educativa
Nazareno) para que la firme.

Refs: US-02
</commit_message>
<xml_diff>
--- a/docs/actas/conformidad-reglas-calculo.docx
+++ b/docs/actas/conformidad-reglas-calculo.docx
@@ -80,7 +80,7 @@
               <w:rPr>
                 <w:sz w:val="20"/>
               </w:rPr>
-              <w:t>[Nombre de la unidad educativa piloto]</w:t>
+              <w:t>Unidad Educativa Nazareno</w:t>
             </w:r>
           </w:p>
         </w:tc>
@@ -1395,6 +1395,1190 @@
           </w:p>
         </w:tc>
       </w:tr>
+      <w:tr>
+        <w:trPr>
+          <w:cantSplit/>
+        </w:trPr>
+        <w:tc>
+          <w:tcPr>
+            <w:tcW w:type="dxa" w:w="567"/>
+          </w:tcPr>
+          <w:p>
+            <w:r>
+              <w:rPr>
+                <w:sz w:val="18"/>
+              </w:rPr>
+              <w:t>6</w:t>
+            </w:r>
+          </w:p>
+        </w:tc>
+        <w:tc>
+          <w:tcPr>
+            <w:tcW w:type="dxa" w:w="3231"/>
+          </w:tcPr>
+          <w:p>
+            <w:r>
+              <w:rPr>
+                <w:sz w:val="18"/>
+              </w:rPr>
+              <w:t>Exactamente 51 sin redondear (aprueba justo)</w:t>
+            </w:r>
+          </w:p>
+        </w:tc>
+        <w:tc>
+          <w:tcPr>
+            <w:tcW w:type="dxa" w:w="737"/>
+          </w:tcPr>
+          <w:p>
+            <w:r>
+              <w:rPr>
+                <w:sz w:val="18"/>
+              </w:rPr>
+              <w:t>50</w:t>
+            </w:r>
+          </w:p>
+        </w:tc>
+        <w:tc>
+          <w:tcPr>
+            <w:tcW w:type="dxa" w:w="737"/>
+          </w:tcPr>
+          <w:p>
+            <w:r>
+              <w:rPr>
+                <w:sz w:val="18"/>
+              </w:rPr>
+              <w:t>60</w:t>
+            </w:r>
+          </w:p>
+        </w:tc>
+        <w:tc>
+          <w:tcPr>
+            <w:tcW w:type="dxa" w:w="737"/>
+          </w:tcPr>
+          <w:p>
+            <w:r>
+              <w:rPr>
+                <w:sz w:val="18"/>
+              </w:rPr>
+              <w:t>40</w:t>
+            </w:r>
+          </w:p>
+        </w:tc>
+        <w:tc>
+          <w:tcPr>
+            <w:tcW w:type="dxa" w:w="964"/>
+          </w:tcPr>
+          <w:p>
+            <w:r>
+              <w:rPr>
+                <w:sz w:val="18"/>
+              </w:rPr>
+              <w:t>60</w:t>
+            </w:r>
+          </w:p>
+        </w:tc>
+        <w:tc>
+          <w:tcPr>
+            <w:tcW w:type="dxa" w:w="2608"/>
+          </w:tcPr>
+          <w:p>
+            <w:r>
+              <w:rPr>
+                <w:sz w:val="18"/>
+              </w:rPr>
+              <w:t>5 + 27 + 16 + 3</w:t>
+            </w:r>
+          </w:p>
+        </w:tc>
+        <w:tc>
+          <w:tcPr>
+            <w:tcW w:type="dxa" w:w="1134"/>
+          </w:tcPr>
+          <w:p>
+            <w:r>
+              <w:rPr>
+                <w:sz w:val="18"/>
+              </w:rPr>
+              <w:t>51</w:t>
+            </w:r>
+          </w:p>
+        </w:tc>
+        <w:tc>
+          <w:tcPr>
+            <w:tcW w:type="dxa" w:w="737"/>
+          </w:tcPr>
+          <w:p>
+            <w:r>
+              <w:rPr>
+                <w:sz w:val="18"/>
+              </w:rPr>
+              <w:t>51</w:t>
+            </w:r>
+          </w:p>
+        </w:tc>
+        <w:tc>
+          <w:tcPr>
+            <w:tcW w:type="dxa" w:w="1134"/>
+          </w:tcPr>
+          <w:p>
+            <w:r>
+              <w:rPr>
+                <w:sz w:val="18"/>
+              </w:rPr>
+              <w:t>Aprueba</w:t>
+            </w:r>
+          </w:p>
+        </w:tc>
+        <w:tc>
+          <w:tcPr>
+            <w:tcW w:type="dxa" w:w="1361"/>
+          </w:tcPr>
+          <w:p>
+            <w:r>
+              <w:rPr>
+                <w:sz w:val="18"/>
+              </w:rPr>
+              <w:t>☐ Sí  ☐ No</w:t>
+            </w:r>
+          </w:p>
+        </w:tc>
+      </w:tr>
+      <w:tr>
+        <w:trPr>
+          <w:cantSplit/>
+        </w:trPr>
+        <w:tc>
+          <w:tcPr>
+            <w:tcW w:type="dxa" w:w="567"/>
+          </w:tcPr>
+          <w:p>
+            <w:r>
+              <w:rPr>
+                <w:sz w:val="18"/>
+              </w:rPr>
+              <w:t>7</w:t>
+            </w:r>
+          </w:p>
+        </w:tc>
+        <w:tc>
+          <w:tcPr>
+            <w:tcW w:type="dxa" w:w="3231"/>
+          </w:tcPr>
+          <w:p>
+            <w:r>
+              <w:rPr>
+                <w:sz w:val="18"/>
+              </w:rPr>
+              <w:t>D2: 50,45 se redondea solo al final (reprueba); por dimensión daría 51</w:t>
+            </w:r>
+          </w:p>
+        </w:tc>
+        <w:tc>
+          <w:tcPr>
+            <w:tcW w:type="dxa" w:w="737"/>
+          </w:tcPr>
+          <w:p>
+            <w:r>
+              <w:rPr>
+                <w:sz w:val="18"/>
+              </w:rPr>
+              <w:t>100</w:t>
+            </w:r>
+          </w:p>
+        </w:tc>
+        <w:tc>
+          <w:tcPr>
+            <w:tcW w:type="dxa" w:w="737"/>
+          </w:tcPr>
+          <w:p>
+            <w:r>
+              <w:rPr>
+                <w:sz w:val="18"/>
+              </w:rPr>
+              <w:t>51</w:t>
+            </w:r>
+          </w:p>
+        </w:tc>
+        <w:tc>
+          <w:tcPr>
+            <w:tcW w:type="dxa" w:w="737"/>
+          </w:tcPr>
+          <w:p>
+            <w:r>
+              <w:rPr>
+                <w:sz w:val="18"/>
+              </w:rPr>
+              <w:t>40</w:t>
+            </w:r>
+          </w:p>
+        </w:tc>
+        <w:tc>
+          <w:tcPr>
+            <w:tcW w:type="dxa" w:w="964"/>
+          </w:tcPr>
+          <w:p>
+            <w:r>
+              <w:rPr>
+                <w:sz w:val="18"/>
+              </w:rPr>
+              <w:t>30</w:t>
+            </w:r>
+          </w:p>
+        </w:tc>
+        <w:tc>
+          <w:tcPr>
+            <w:tcW w:type="dxa" w:w="2608"/>
+          </w:tcPr>
+          <w:p>
+            <w:r>
+              <w:rPr>
+                <w:sz w:val="18"/>
+              </w:rPr>
+              <w:t>10 + 22,95 + 16 + 1,5</w:t>
+            </w:r>
+          </w:p>
+        </w:tc>
+        <w:tc>
+          <w:tcPr>
+            <w:tcW w:type="dxa" w:w="1134"/>
+          </w:tcPr>
+          <w:p>
+            <w:r>
+              <w:rPr>
+                <w:sz w:val="18"/>
+              </w:rPr>
+              <w:t>50,45</w:t>
+            </w:r>
+          </w:p>
+        </w:tc>
+        <w:tc>
+          <w:tcPr>
+            <w:tcW w:type="dxa" w:w="737"/>
+          </w:tcPr>
+          <w:p>
+            <w:r>
+              <w:rPr>
+                <w:sz w:val="18"/>
+              </w:rPr>
+              <w:t>50</w:t>
+            </w:r>
+          </w:p>
+        </w:tc>
+        <w:tc>
+          <w:tcPr>
+            <w:tcW w:type="dxa" w:w="1134"/>
+          </w:tcPr>
+          <w:p>
+            <w:r>
+              <w:rPr>
+                <w:sz w:val="18"/>
+              </w:rPr>
+              <w:t>Reprueba</w:t>
+            </w:r>
+          </w:p>
+        </w:tc>
+        <w:tc>
+          <w:tcPr>
+            <w:tcW w:type="dxa" w:w="1361"/>
+          </w:tcPr>
+          <w:p>
+            <w:r>
+              <w:rPr>
+                <w:sz w:val="18"/>
+              </w:rPr>
+              <w:t>☐ Sí  ☐ No</w:t>
+            </w:r>
+          </w:p>
+        </w:tc>
+      </w:tr>
+      <w:tr>
+        <w:trPr>
+          <w:cantSplit/>
+        </w:trPr>
+        <w:tc>
+          <w:tcPr>
+            <w:tcW w:type="dxa" w:w="567"/>
+          </w:tcPr>
+          <w:p>
+            <w:r>
+              <w:rPr>
+                <w:sz w:val="18"/>
+              </w:rPr>
+              <w:t>8</w:t>
+            </w:r>
+          </w:p>
+        </w:tc>
+        <w:tc>
+          <w:tcPr>
+            <w:tcW w:type="dxa" w:w="3231"/>
+          </w:tcPr>
+          <w:p>
+            <w:r>
+              <w:rPr>
+                <w:sz w:val="18"/>
+              </w:rPr>
+              <w:t>Frontera: 50,55 se redondea a 51 (aprueba)</w:t>
+            </w:r>
+          </w:p>
+        </w:tc>
+        <w:tc>
+          <w:tcPr>
+            <w:tcW w:type="dxa" w:w="737"/>
+          </w:tcPr>
+          <w:p>
+            <w:r>
+              <w:rPr>
+                <w:sz w:val="18"/>
+              </w:rPr>
+              <w:t>100</w:t>
+            </w:r>
+          </w:p>
+        </w:tc>
+        <w:tc>
+          <w:tcPr>
+            <w:tcW w:type="dxa" w:w="737"/>
+          </w:tcPr>
+          <w:p>
+            <w:r>
+              <w:rPr>
+                <w:sz w:val="18"/>
+              </w:rPr>
+              <w:t>51</w:t>
+            </w:r>
+          </w:p>
+        </w:tc>
+        <w:tc>
+          <w:tcPr>
+            <w:tcW w:type="dxa" w:w="737"/>
+          </w:tcPr>
+          <w:p>
+            <w:r>
+              <w:rPr>
+                <w:sz w:val="18"/>
+              </w:rPr>
+              <w:t>40</w:t>
+            </w:r>
+          </w:p>
+        </w:tc>
+        <w:tc>
+          <w:tcPr>
+            <w:tcW w:type="dxa" w:w="964"/>
+          </w:tcPr>
+          <w:p>
+            <w:r>
+              <w:rPr>
+                <w:sz w:val="18"/>
+              </w:rPr>
+              <w:t>32</w:t>
+            </w:r>
+          </w:p>
+        </w:tc>
+        <w:tc>
+          <w:tcPr>
+            <w:tcW w:type="dxa" w:w="2608"/>
+          </w:tcPr>
+          <w:p>
+            <w:r>
+              <w:rPr>
+                <w:sz w:val="18"/>
+              </w:rPr>
+              <w:t>10 + 22,95 + 16 + 1,6</w:t>
+            </w:r>
+          </w:p>
+        </w:tc>
+        <w:tc>
+          <w:tcPr>
+            <w:tcW w:type="dxa" w:w="1134"/>
+          </w:tcPr>
+          <w:p>
+            <w:r>
+              <w:rPr>
+                <w:sz w:val="18"/>
+              </w:rPr>
+              <w:t>50,55</w:t>
+            </w:r>
+          </w:p>
+        </w:tc>
+        <w:tc>
+          <w:tcPr>
+            <w:tcW w:type="dxa" w:w="737"/>
+          </w:tcPr>
+          <w:p>
+            <w:r>
+              <w:rPr>
+                <w:sz w:val="18"/>
+              </w:rPr>
+              <w:t>51</w:t>
+            </w:r>
+          </w:p>
+        </w:tc>
+        <w:tc>
+          <w:tcPr>
+            <w:tcW w:type="dxa" w:w="1134"/>
+          </w:tcPr>
+          <w:p>
+            <w:r>
+              <w:rPr>
+                <w:sz w:val="18"/>
+              </w:rPr>
+              <w:t>Aprueba</w:t>
+            </w:r>
+          </w:p>
+        </w:tc>
+        <w:tc>
+          <w:tcPr>
+            <w:tcW w:type="dxa" w:w="1361"/>
+          </w:tcPr>
+          <w:p>
+            <w:r>
+              <w:rPr>
+                <w:sz w:val="18"/>
+              </w:rPr>
+              <w:t>☐ Sí  ☐ No</w:t>
+            </w:r>
+          </w:p>
+        </w:tc>
+      </w:tr>
+      <w:tr>
+        <w:trPr>
+          <w:cantSplit/>
+        </w:trPr>
+        <w:tc>
+          <w:tcPr>
+            <w:tcW w:type="dxa" w:w="567"/>
+          </w:tcPr>
+          <w:p>
+            <w:r>
+              <w:rPr>
+                <w:sz w:val="18"/>
+              </w:rPr>
+              <w:t>9</w:t>
+            </w:r>
+          </w:p>
+        </w:tc>
+        <w:tc>
+          <w:tcPr>
+            <w:tcW w:type="dxa" w:w="3231"/>
+          </w:tcPr>
+          <w:p>
+            <w:r>
+              <w:rPr>
+                <w:sz w:val="18"/>
+              </w:rPr>
+              <w:t>Frontera alta: 99,5 se redondea a 100</w:t>
+            </w:r>
+          </w:p>
+        </w:tc>
+        <w:tc>
+          <w:tcPr>
+            <w:tcW w:type="dxa" w:w="737"/>
+          </w:tcPr>
+          <w:p>
+            <w:r>
+              <w:rPr>
+                <w:sz w:val="18"/>
+              </w:rPr>
+              <w:t>100</w:t>
+            </w:r>
+          </w:p>
+        </w:tc>
+        <w:tc>
+          <w:tcPr>
+            <w:tcW w:type="dxa" w:w="737"/>
+          </w:tcPr>
+          <w:p>
+            <w:r>
+              <w:rPr>
+                <w:sz w:val="18"/>
+              </w:rPr>
+              <w:t>100</w:t>
+            </w:r>
+          </w:p>
+        </w:tc>
+        <w:tc>
+          <w:tcPr>
+            <w:tcW w:type="dxa" w:w="737"/>
+          </w:tcPr>
+          <w:p>
+            <w:r>
+              <w:rPr>
+                <w:sz w:val="18"/>
+              </w:rPr>
+              <w:t>100</w:t>
+            </w:r>
+          </w:p>
+        </w:tc>
+        <w:tc>
+          <w:tcPr>
+            <w:tcW w:type="dxa" w:w="964"/>
+          </w:tcPr>
+          <w:p>
+            <w:r>
+              <w:rPr>
+                <w:sz w:val="18"/>
+              </w:rPr>
+              <w:t>90</w:t>
+            </w:r>
+          </w:p>
+        </w:tc>
+        <w:tc>
+          <w:tcPr>
+            <w:tcW w:type="dxa" w:w="2608"/>
+          </w:tcPr>
+          <w:p>
+            <w:r>
+              <w:rPr>
+                <w:sz w:val="18"/>
+              </w:rPr>
+              <w:t>10 + 45 + 40 + 4,5</w:t>
+            </w:r>
+          </w:p>
+        </w:tc>
+        <w:tc>
+          <w:tcPr>
+            <w:tcW w:type="dxa" w:w="1134"/>
+          </w:tcPr>
+          <w:p>
+            <w:r>
+              <w:rPr>
+                <w:sz w:val="18"/>
+              </w:rPr>
+              <w:t>99,5</w:t>
+            </w:r>
+          </w:p>
+        </w:tc>
+        <w:tc>
+          <w:tcPr>
+            <w:tcW w:type="dxa" w:w="737"/>
+          </w:tcPr>
+          <w:p>
+            <w:r>
+              <w:rPr>
+                <w:sz w:val="18"/>
+              </w:rPr>
+              <w:t>100</w:t>
+            </w:r>
+          </w:p>
+        </w:tc>
+        <w:tc>
+          <w:tcPr>
+            <w:tcW w:type="dxa" w:w="1134"/>
+          </w:tcPr>
+          <w:p>
+            <w:r>
+              <w:rPr>
+                <w:sz w:val="18"/>
+              </w:rPr>
+              <w:t>Aprueba</w:t>
+            </w:r>
+          </w:p>
+        </w:tc>
+        <w:tc>
+          <w:tcPr>
+            <w:tcW w:type="dxa" w:w="1361"/>
+          </w:tcPr>
+          <w:p>
+            <w:r>
+              <w:rPr>
+                <w:sz w:val="18"/>
+              </w:rPr>
+              <w:t>☐ Sí  ☐ No</w:t>
+            </w:r>
+          </w:p>
+        </w:tc>
+      </w:tr>
+      <w:tr>
+        <w:trPr>
+          <w:cantSplit/>
+        </w:trPr>
+        <w:tc>
+          <w:tcPr>
+            <w:tcW w:type="dxa" w:w="567"/>
+          </w:tcPr>
+          <w:p>
+            <w:r>
+              <w:rPr>
+                <w:sz w:val="18"/>
+              </w:rPr>
+              <w:t>10</w:t>
+            </w:r>
+          </w:p>
+        </w:tc>
+        <w:tc>
+          <w:tcPr>
+            <w:tcW w:type="dxa" w:w="3231"/>
+          </w:tcPr>
+          <w:p>
+            <w:r>
+              <w:rPr>
+                <w:sz w:val="18"/>
+              </w:rPr>
+              <w:t>Promedios con decimales (Ser 85,5; Saber 72,25; Hacer 68,75)</w:t>
+            </w:r>
+          </w:p>
+        </w:tc>
+        <w:tc>
+          <w:tcPr>
+            <w:tcW w:type="dxa" w:w="737"/>
+          </w:tcPr>
+          <w:p>
+            <w:r>
+              <w:rPr>
+                <w:sz w:val="18"/>
+              </w:rPr>
+              <w:t>85.5</w:t>
+            </w:r>
+          </w:p>
+        </w:tc>
+        <w:tc>
+          <w:tcPr>
+            <w:tcW w:type="dxa" w:w="737"/>
+          </w:tcPr>
+          <w:p>
+            <w:r>
+              <w:rPr>
+                <w:sz w:val="18"/>
+              </w:rPr>
+              <w:t>72.25</w:t>
+            </w:r>
+          </w:p>
+        </w:tc>
+        <w:tc>
+          <w:tcPr>
+            <w:tcW w:type="dxa" w:w="737"/>
+          </w:tcPr>
+          <w:p>
+            <w:r>
+              <w:rPr>
+                <w:sz w:val="18"/>
+              </w:rPr>
+              <w:t>68.75</w:t>
+            </w:r>
+          </w:p>
+        </w:tc>
+        <w:tc>
+          <w:tcPr>
+            <w:tcW w:type="dxa" w:w="964"/>
+          </w:tcPr>
+          <w:p>
+            <w:r>
+              <w:rPr>
+                <w:sz w:val="18"/>
+              </w:rPr>
+              <w:t>90</w:t>
+            </w:r>
+          </w:p>
+        </w:tc>
+        <w:tc>
+          <w:tcPr>
+            <w:tcW w:type="dxa" w:w="2608"/>
+          </w:tcPr>
+          <w:p>
+            <w:r>
+              <w:rPr>
+                <w:sz w:val="18"/>
+              </w:rPr>
+              <w:t>8,55 + 32,51 + 27,5 + 4,5</w:t>
+            </w:r>
+          </w:p>
+        </w:tc>
+        <w:tc>
+          <w:tcPr>
+            <w:tcW w:type="dxa" w:w="1134"/>
+          </w:tcPr>
+          <w:p>
+            <w:r>
+              <w:rPr>
+                <w:sz w:val="18"/>
+              </w:rPr>
+              <w:t>73,06</w:t>
+            </w:r>
+          </w:p>
+        </w:tc>
+        <w:tc>
+          <w:tcPr>
+            <w:tcW w:type="dxa" w:w="737"/>
+          </w:tcPr>
+          <w:p>
+            <w:r>
+              <w:rPr>
+                <w:sz w:val="18"/>
+              </w:rPr>
+              <w:t>73</w:t>
+            </w:r>
+          </w:p>
+        </w:tc>
+        <w:tc>
+          <w:tcPr>
+            <w:tcW w:type="dxa" w:w="1134"/>
+          </w:tcPr>
+          <w:p>
+            <w:r>
+              <w:rPr>
+                <w:sz w:val="18"/>
+              </w:rPr>
+              <w:t>Aprueba</w:t>
+            </w:r>
+          </w:p>
+        </w:tc>
+        <w:tc>
+          <w:tcPr>
+            <w:tcW w:type="dxa" w:w="1361"/>
+          </w:tcPr>
+          <w:p>
+            <w:r>
+              <w:rPr>
+                <w:sz w:val="18"/>
+              </w:rPr>
+              <w:t>☐ Sí  ☐ No</w:t>
+            </w:r>
+          </w:p>
+        </w:tc>
+      </w:tr>
+      <w:tr>
+        <w:trPr>
+          <w:cantSplit/>
+        </w:trPr>
+        <w:tc>
+          <w:tcPr>
+            <w:tcW w:type="dxa" w:w="567"/>
+          </w:tcPr>
+          <w:p>
+            <w:r>
+              <w:rPr>
+                <w:sz w:val="18"/>
+              </w:rPr>
+              <w:t>11</w:t>
+            </w:r>
+          </w:p>
+        </w:tc>
+        <w:tc>
+          <w:tcPr>
+            <w:tcW w:type="dxa" w:w="3231"/>
+          </w:tcPr>
+          <w:p>
+            <w:r>
+              <w:rPr>
+                <w:sz w:val="18"/>
+              </w:rPr>
+              <w:t>Saber y Hacer al máximo con Ser y Autoevaluación en 1 (aprueba)</w:t>
+            </w:r>
+          </w:p>
+        </w:tc>
+        <w:tc>
+          <w:tcPr>
+            <w:tcW w:type="dxa" w:w="737"/>
+          </w:tcPr>
+          <w:p>
+            <w:r>
+              <w:rPr>
+                <w:sz w:val="18"/>
+              </w:rPr>
+              <w:t>1</w:t>
+            </w:r>
+          </w:p>
+        </w:tc>
+        <w:tc>
+          <w:tcPr>
+            <w:tcW w:type="dxa" w:w="737"/>
+          </w:tcPr>
+          <w:p>
+            <w:r>
+              <w:rPr>
+                <w:sz w:val="18"/>
+              </w:rPr>
+              <w:t>100</w:t>
+            </w:r>
+          </w:p>
+        </w:tc>
+        <w:tc>
+          <w:tcPr>
+            <w:tcW w:type="dxa" w:w="737"/>
+          </w:tcPr>
+          <w:p>
+            <w:r>
+              <w:rPr>
+                <w:sz w:val="18"/>
+              </w:rPr>
+              <w:t>100</w:t>
+            </w:r>
+          </w:p>
+        </w:tc>
+        <w:tc>
+          <w:tcPr>
+            <w:tcW w:type="dxa" w:w="964"/>
+          </w:tcPr>
+          <w:p>
+            <w:r>
+              <w:rPr>
+                <w:sz w:val="18"/>
+              </w:rPr>
+              <w:t>1</w:t>
+            </w:r>
+          </w:p>
+        </w:tc>
+        <w:tc>
+          <w:tcPr>
+            <w:tcW w:type="dxa" w:w="2608"/>
+          </w:tcPr>
+          <w:p>
+            <w:r>
+              <w:rPr>
+                <w:sz w:val="18"/>
+              </w:rPr>
+              <w:t>0,1 + 45 + 40 + 0,05</w:t>
+            </w:r>
+          </w:p>
+        </w:tc>
+        <w:tc>
+          <w:tcPr>
+            <w:tcW w:type="dxa" w:w="1134"/>
+          </w:tcPr>
+          <w:p>
+            <w:r>
+              <w:rPr>
+                <w:sz w:val="18"/>
+              </w:rPr>
+              <w:t>85,15</w:t>
+            </w:r>
+          </w:p>
+        </w:tc>
+        <w:tc>
+          <w:tcPr>
+            <w:tcW w:type="dxa" w:w="737"/>
+          </w:tcPr>
+          <w:p>
+            <w:r>
+              <w:rPr>
+                <w:sz w:val="18"/>
+              </w:rPr>
+              <w:t>85</w:t>
+            </w:r>
+          </w:p>
+        </w:tc>
+        <w:tc>
+          <w:tcPr>
+            <w:tcW w:type="dxa" w:w="1134"/>
+          </w:tcPr>
+          <w:p>
+            <w:r>
+              <w:rPr>
+                <w:sz w:val="18"/>
+              </w:rPr>
+              <w:t>Aprueba</w:t>
+            </w:r>
+          </w:p>
+        </w:tc>
+        <w:tc>
+          <w:tcPr>
+            <w:tcW w:type="dxa" w:w="1361"/>
+          </w:tcPr>
+          <w:p>
+            <w:r>
+              <w:rPr>
+                <w:sz w:val="18"/>
+              </w:rPr>
+              <w:t>☐ Sí  ☐ No</w:t>
+            </w:r>
+          </w:p>
+        </w:tc>
+      </w:tr>
+      <w:tr>
+        <w:trPr>
+          <w:cantSplit/>
+        </w:trPr>
+        <w:tc>
+          <w:tcPr>
+            <w:tcW w:type="dxa" w:w="567"/>
+          </w:tcPr>
+          <w:p>
+            <w:r>
+              <w:rPr>
+                <w:sz w:val="18"/>
+              </w:rPr>
+              <w:t>12</w:t>
+            </w:r>
+          </w:p>
+        </w:tc>
+        <w:tc>
+          <w:tcPr>
+            <w:tcW w:type="dxa" w:w="3231"/>
+          </w:tcPr>
+          <w:p>
+            <w:r>
+              <w:rPr>
+                <w:sz w:val="18"/>
+              </w:rPr>
+              <w:t>Saber y Hacer en 50 con Ser y Autoevaluación al máximo (aprueba)</w:t>
+            </w:r>
+          </w:p>
+        </w:tc>
+        <w:tc>
+          <w:tcPr>
+            <w:tcW w:type="dxa" w:w="737"/>
+          </w:tcPr>
+          <w:p>
+            <w:r>
+              <w:rPr>
+                <w:sz w:val="18"/>
+              </w:rPr>
+              <w:t>100</w:t>
+            </w:r>
+          </w:p>
+        </w:tc>
+        <w:tc>
+          <w:tcPr>
+            <w:tcW w:type="dxa" w:w="737"/>
+          </w:tcPr>
+          <w:p>
+            <w:r>
+              <w:rPr>
+                <w:sz w:val="18"/>
+              </w:rPr>
+              <w:t>50</w:t>
+            </w:r>
+          </w:p>
+        </w:tc>
+        <w:tc>
+          <w:tcPr>
+            <w:tcW w:type="dxa" w:w="737"/>
+          </w:tcPr>
+          <w:p>
+            <w:r>
+              <w:rPr>
+                <w:sz w:val="18"/>
+              </w:rPr>
+              <w:t>50</w:t>
+            </w:r>
+          </w:p>
+        </w:tc>
+        <w:tc>
+          <w:tcPr>
+            <w:tcW w:type="dxa" w:w="964"/>
+          </w:tcPr>
+          <w:p>
+            <w:r>
+              <w:rPr>
+                <w:sz w:val="18"/>
+              </w:rPr>
+              <w:t>100</w:t>
+            </w:r>
+          </w:p>
+        </w:tc>
+        <w:tc>
+          <w:tcPr>
+            <w:tcW w:type="dxa" w:w="2608"/>
+          </w:tcPr>
+          <w:p>
+            <w:r>
+              <w:rPr>
+                <w:sz w:val="18"/>
+              </w:rPr>
+              <w:t>10 + 22,5 + 20 + 5</w:t>
+            </w:r>
+          </w:p>
+        </w:tc>
+        <w:tc>
+          <w:tcPr>
+            <w:tcW w:type="dxa" w:w="1134"/>
+          </w:tcPr>
+          <w:p>
+            <w:r>
+              <w:rPr>
+                <w:sz w:val="18"/>
+              </w:rPr>
+              <w:t>57,5</w:t>
+            </w:r>
+          </w:p>
+        </w:tc>
+        <w:tc>
+          <w:tcPr>
+            <w:tcW w:type="dxa" w:w="737"/>
+          </w:tcPr>
+          <w:p>
+            <w:r>
+              <w:rPr>
+                <w:sz w:val="18"/>
+              </w:rPr>
+              <w:t>58</w:t>
+            </w:r>
+          </w:p>
+        </w:tc>
+        <w:tc>
+          <w:tcPr>
+            <w:tcW w:type="dxa" w:w="1134"/>
+          </w:tcPr>
+          <w:p>
+            <w:r>
+              <w:rPr>
+                <w:sz w:val="18"/>
+              </w:rPr>
+              <w:t>Aprueba</w:t>
+            </w:r>
+          </w:p>
+        </w:tc>
+        <w:tc>
+          <w:tcPr>
+            <w:tcW w:type="dxa" w:w="1361"/>
+          </w:tcPr>
+          <w:p>
+            <w:r>
+              <w:rPr>
+                <w:sz w:val="18"/>
+              </w:rPr>
+              <w:t>☐ Sí  ☐ No</w:t>
+            </w:r>
+          </w:p>
+        </w:tc>
+      </w:tr>
+      <w:tr>
+        <w:trPr>
+          <w:cantSplit/>
+        </w:trPr>
+        <w:tc>
+          <w:tcPr>
+            <w:tcW w:type="dxa" w:w="567"/>
+          </w:tcPr>
+          <w:p>
+            <w:r>
+              <w:rPr>
+                <w:sz w:val="18"/>
+              </w:rPr>
+              <w:t>13</w:t>
+            </w:r>
+          </w:p>
+        </w:tc>
+        <w:tc>
+          <w:tcPr>
+            <w:tcW w:type="dxa" w:w="3231"/>
+          </w:tcPr>
+          <w:p>
+            <w:r>
+              <w:rPr>
+                <w:sz w:val="18"/>
+              </w:rPr>
+              <w:t>D1: actividades no presentadas registradas con 1 en Saber y Hacer (reprueba)</w:t>
+            </w:r>
+          </w:p>
+        </w:tc>
+        <w:tc>
+          <w:tcPr>
+            <w:tcW w:type="dxa" w:w="737"/>
+          </w:tcPr>
+          <w:p>
+            <w:r>
+              <w:rPr>
+                <w:sz w:val="18"/>
+              </w:rPr>
+              <w:t>90</w:t>
+            </w:r>
+          </w:p>
+        </w:tc>
+        <w:tc>
+          <w:tcPr>
+            <w:tcW w:type="dxa" w:w="737"/>
+          </w:tcPr>
+          <w:p>
+            <w:r>
+              <w:rPr>
+                <w:sz w:val="18"/>
+              </w:rPr>
+              <w:t>1</w:t>
+            </w:r>
+          </w:p>
+        </w:tc>
+        <w:tc>
+          <w:tcPr>
+            <w:tcW w:type="dxa" w:w="737"/>
+          </w:tcPr>
+          <w:p>
+            <w:r>
+              <w:rPr>
+                <w:sz w:val="18"/>
+              </w:rPr>
+              <w:t>1</w:t>
+            </w:r>
+          </w:p>
+        </w:tc>
+        <w:tc>
+          <w:tcPr>
+            <w:tcW w:type="dxa" w:w="964"/>
+          </w:tcPr>
+          <w:p>
+            <w:r>
+              <w:rPr>
+                <w:sz w:val="18"/>
+              </w:rPr>
+              <w:t>100</w:t>
+            </w:r>
+          </w:p>
+        </w:tc>
+        <w:tc>
+          <w:tcPr>
+            <w:tcW w:type="dxa" w:w="2608"/>
+          </w:tcPr>
+          <w:p>
+            <w:r>
+              <w:rPr>
+                <w:sz w:val="18"/>
+              </w:rPr>
+              <w:t>9 + 0,45 + 0,4 + 5</w:t>
+            </w:r>
+          </w:p>
+        </w:tc>
+        <w:tc>
+          <w:tcPr>
+            <w:tcW w:type="dxa" w:w="1134"/>
+          </w:tcPr>
+          <w:p>
+            <w:r>
+              <w:rPr>
+                <w:sz w:val="18"/>
+              </w:rPr>
+              <w:t>14,85</w:t>
+            </w:r>
+          </w:p>
+        </w:tc>
+        <w:tc>
+          <w:tcPr>
+            <w:tcW w:type="dxa" w:w="737"/>
+          </w:tcPr>
+          <w:p>
+            <w:r>
+              <w:rPr>
+                <w:sz w:val="18"/>
+              </w:rPr>
+              <w:t>15</w:t>
+            </w:r>
+          </w:p>
+        </w:tc>
+        <w:tc>
+          <w:tcPr>
+            <w:tcW w:type="dxa" w:w="1134"/>
+          </w:tcPr>
+          <w:p>
+            <w:r>
+              <w:rPr>
+                <w:sz w:val="18"/>
+              </w:rPr>
+              <w:t>Reprueba</w:t>
+            </w:r>
+          </w:p>
+        </w:tc>
+        <w:tc>
+          <w:tcPr>
+            <w:tcW w:type="dxa" w:w="1361"/>
+          </w:tcPr>
+          <w:p>
+            <w:r>
+              <w:rPr>
+                <w:sz w:val="18"/>
+              </w:rPr>
+              <w:t>☐ Sí  ☐ No</w:t>
+            </w:r>
+          </w:p>
+        </w:tc>
+      </w:tr>
     </w:tbl>
     <w:p/>
     <w:p>
@@ -1549,7 +2733,7 @@
               <w:rPr>
                 <w:sz w:val="18"/>
               </w:rPr>
-              <w:t>6</w:t>
+              <w:t>14</w:t>
             </w:r>
           </w:p>
         </w:tc>
@@ -1645,7 +2829,7 @@
               <w:rPr>
                 <w:sz w:val="18"/>
               </w:rPr>
-              <w:t>7</w:t>
+              <w:t>15</w:t>
             </w:r>
           </w:p>
         </w:tc>
@@ -1741,7 +2925,7 @@
               <w:rPr>
                 <w:sz w:val="18"/>
               </w:rPr>
-              <w:t>8</w:t>
+              <w:t>16</w:t>
             </w:r>
           </w:p>
         </w:tc>
@@ -2322,7 +3506,7 @@
               <w:rPr>
                 <w:sz w:val="18"/>
               </w:rPr>
-              <w:t>Menos de 80 %, configurable por gestión. Riesgo = promedio &lt; 51 o asistencia &lt; 80 %.</w:t>
+              <w:t>Menos de 80 %, configurable por gestión (gestiones.umbral_asistencia, lo cambia el administrador con PUT /api/gestiones/:id/umbral-asistencia). Riesgo = promedio &lt; 51 o asistencia &lt; umbral.</w:t>
             </w:r>
           </w:p>
         </w:tc>
@@ -2668,6 +3852,627 @@
                 <w:sz w:val="18"/>
               </w:rPr>
               <w:t>El token dura 30 minutos y la web lo renueva (POST /api/auth/renovar) mientras el usuario trabaja; sin peticiones durante 30 minutos, vence.</w:t>
+            </w:r>
+          </w:p>
+        </w:tc>
+        <w:tc>
+          <w:tcPr>
+            <w:tcW w:type="dxa" w:w="1134"/>
+          </w:tcPr>
+          <w:p>
+            <w:r>
+              <w:rPr>
+                <w:sz w:val="18"/>
+              </w:rPr>
+              <w:t>☐</w:t>
+            </w:r>
+          </w:p>
+        </w:tc>
+        <w:tc>
+          <w:tcPr>
+            <w:tcW w:type="dxa" w:w="3118"/>
+          </w:tcPr>
+          <w:p>
+            <w:r>
+              <w:rPr>
+                <w:sz w:val="18"/>
+              </w:rPr>
+            </w:r>
+          </w:p>
+        </w:tc>
+      </w:tr>
+      <w:tr>
+        <w:trPr>
+          <w:cantSplit/>
+        </w:trPr>
+        <w:tc>
+          <w:tcPr>
+            <w:tcW w:type="dxa" w:w="567"/>
+          </w:tcPr>
+          <w:p>
+            <w:r>
+              <w:rPr>
+                <w:sz w:val="18"/>
+              </w:rPr>
+              <w:t>D12</w:t>
+            </w:r>
+          </w:p>
+        </w:tc>
+        <w:tc>
+          <w:tcPr>
+            <w:tcW w:type="dxa" w:w="3402"/>
+          </w:tcPr>
+          <w:p>
+            <w:r>
+              <w:rPr>
+                <w:sz w:val="18"/>
+              </w:rPr>
+              <w:t>¿Qué muestra el historial del estudiante y quién lo ve?</w:t>
+            </w:r>
+          </w:p>
+        </w:tc>
+        <w:tc>
+          <w:tcPr>
+            <w:tcW w:type="dxa" w:w="5669"/>
+          </w:tcPr>
+          <w:p>
+            <w:r>
+              <w:rPr>
+                <w:sz w:val="18"/>
+              </w:rPr>
+              <w:t>Todas las materias de su curso en cada trimestre, con la nota calculada al consultar. El profesor lo ve si dicta al menos una materia del curso; la secretaria y el administrador, siempre. Promedio del trimestre = promedio de las notas de las materias, con dos decimales (pendiente si falta alguna); promedio anual = promedio de los trimestres con nota; tendencia = comparación de los dos últimos trimestres con nota; en riesgo si el promedio anual es menor que 51. Son indicadores, no notas oficiales (las oficiales son D2 y D3 por materia).</w:t>
+            </w:r>
+          </w:p>
+        </w:tc>
+        <w:tc>
+          <w:tcPr>
+            <w:tcW w:type="dxa" w:w="1134"/>
+          </w:tcPr>
+          <w:p>
+            <w:r>
+              <w:rPr>
+                <w:sz w:val="18"/>
+              </w:rPr>
+              <w:t>☐</w:t>
+            </w:r>
+          </w:p>
+        </w:tc>
+        <w:tc>
+          <w:tcPr>
+            <w:tcW w:type="dxa" w:w="3118"/>
+          </w:tcPr>
+          <w:p>
+            <w:r>
+              <w:rPr>
+                <w:sz w:val="18"/>
+              </w:rPr>
+            </w:r>
+          </w:p>
+        </w:tc>
+      </w:tr>
+      <w:tr>
+        <w:trPr>
+          <w:cantSplit/>
+        </w:trPr>
+        <w:tc>
+          <w:tcPr>
+            <w:tcW w:type="dxa" w:w="567"/>
+          </w:tcPr>
+          <w:p>
+            <w:r>
+              <w:rPr>
+                <w:sz w:val="18"/>
+              </w:rPr>
+              <w:t>D13</w:t>
+            </w:r>
+          </w:p>
+        </w:tc>
+        <w:tc>
+          <w:tcPr>
+            <w:tcW w:type="dxa" w:w="3402"/>
+          </w:tcPr>
+          <w:p>
+            <w:r>
+              <w:rPr>
+                <w:sz w:val="18"/>
+              </w:rPr>
+              <w:t>¿Cómo funciona la entrega de notas de una materia?</w:t>
+            </w:r>
+          </w:p>
+        </w:tc>
+        <w:tc>
+          <w:tcPr>
+            <w:tcW w:type="dxa" w:w="5669"/>
+          </w:tcPr>
+          <w:p>
+            <w:r>
+              <w:rPr>
+                <w:sz w:val="18"/>
+              </w:rPr>
+              <w:t>El profesor asignado la entrega una sola vez por trimestre, cuando no falta ninguna nota del curso, y no se puede deshacer; no se entrega en un trimestre cerrado. Después de entregar, las correcciones siguen por US-04 con su auditoría. Si la secretaria no indica el trimestre, el control muestra el primero abierto de la última gestión.</w:t>
+            </w:r>
+          </w:p>
+        </w:tc>
+        <w:tc>
+          <w:tcPr>
+            <w:tcW w:type="dxa" w:w="1134"/>
+          </w:tcPr>
+          <w:p>
+            <w:r>
+              <w:rPr>
+                <w:sz w:val="18"/>
+              </w:rPr>
+              <w:t>☐</w:t>
+            </w:r>
+          </w:p>
+        </w:tc>
+        <w:tc>
+          <w:tcPr>
+            <w:tcW w:type="dxa" w:w="3118"/>
+          </w:tcPr>
+          <w:p>
+            <w:r>
+              <w:rPr>
+                <w:sz w:val="18"/>
+              </w:rPr>
+            </w:r>
+          </w:p>
+        </w:tc>
+      </w:tr>
+      <w:tr>
+        <w:trPr>
+          <w:cantSplit/>
+        </w:trPr>
+        <w:tc>
+          <w:tcPr>
+            <w:tcW w:type="dxa" w:w="567"/>
+          </w:tcPr>
+          <w:p>
+            <w:r>
+              <w:rPr>
+                <w:sz w:val="18"/>
+              </w:rPr>
+              <w:t>D14</w:t>
+            </w:r>
+          </w:p>
+        </w:tc>
+        <w:tc>
+          <w:tcPr>
+            <w:tcW w:type="dxa" w:w="3402"/>
+          </w:tcPr>
+          <w:p>
+            <w:r>
+              <w:rPr>
+                <w:sz w:val="18"/>
+              </w:rPr>
+              <w:t>¿Cómo se importan notas desde Excel?</w:t>
+            </w:r>
+          </w:p>
+        </w:tc>
+        <w:tc>
+          <w:tcPr>
+            <w:tcW w:type="dxa" w:w="5669"/>
+          </w:tcPr>
+          <w:p>
+            <w:r>
+              <w:rPr>
+                <w:sz w:val="18"/>
+              </w:rPr>
+              <w:t>Con la plantilla .xlsx del sistema (Código RUDE, Estudiante, Nota), una actividad por archivo, hasta 1 MB y 1000 filas. Se identifica al estudiante por su RUDE en el curso; las filas sin nota se ignoran. Una nota que ya existe no se reemplaza: la fila se rechaza y se corrige con motivo (US-04). Al confirmar, la API vuelve a validar el mismo archivo y guarda las filas válidas en una transacción.</w:t>
+            </w:r>
+          </w:p>
+        </w:tc>
+        <w:tc>
+          <w:tcPr>
+            <w:tcW w:type="dxa" w:w="1134"/>
+          </w:tcPr>
+          <w:p>
+            <w:r>
+              <w:rPr>
+                <w:sz w:val="18"/>
+              </w:rPr>
+              <w:t>☐</w:t>
+            </w:r>
+          </w:p>
+        </w:tc>
+        <w:tc>
+          <w:tcPr>
+            <w:tcW w:type="dxa" w:w="3118"/>
+          </w:tcPr>
+          <w:p>
+            <w:r>
+              <w:rPr>
+                <w:sz w:val="18"/>
+              </w:rPr>
+            </w:r>
+          </w:p>
+        </w:tc>
+      </w:tr>
+      <w:tr>
+        <w:trPr>
+          <w:cantSplit/>
+        </w:trPr>
+        <w:tc>
+          <w:tcPr>
+            <w:tcW w:type="dxa" w:w="567"/>
+          </w:tcPr>
+          <w:p>
+            <w:r>
+              <w:rPr>
+                <w:sz w:val="18"/>
+              </w:rPr>
+              <w:t>D15</w:t>
+            </w:r>
+          </w:p>
+        </w:tc>
+        <w:tc>
+          <w:tcPr>
+            <w:tcW w:type="dxa" w:w="3402"/>
+          </w:tcPr>
+          <w:p>
+            <w:r>
+              <w:rPr>
+                <w:sz w:val="18"/>
+              </w:rPr>
+              <w:t>¿Se registra la cédula de identidad (CI) del estudiante?</w:t>
+            </w:r>
+          </w:p>
+        </w:tc>
+        <w:tc>
+          <w:tcPr>
+            <w:tcW w:type="dxa" w:w="5669"/>
+          </w:tcPr>
+          <w:p>
+            <w:r>
+              <w:rPr>
+                <w:sz w:val="18"/>
+              </w:rPr>
+              <w:t>Sí, opcional, a pedido del equipo de frontend (no la exige ninguna historia). De 5 a 15 caracteres: números, letras, espacio o guion, en mayúsculas. No identifica al estudiante (lo hace el RUDE, D10) y no se valida contra el SEGIP. La ven la secretaria, el administrador y el profesor en el historial.</w:t>
+            </w:r>
+          </w:p>
+        </w:tc>
+        <w:tc>
+          <w:tcPr>
+            <w:tcW w:type="dxa" w:w="1134"/>
+          </w:tcPr>
+          <w:p>
+            <w:r>
+              <w:rPr>
+                <w:sz w:val="18"/>
+              </w:rPr>
+              <w:t>☐</w:t>
+            </w:r>
+          </w:p>
+        </w:tc>
+        <w:tc>
+          <w:tcPr>
+            <w:tcW w:type="dxa" w:w="3118"/>
+          </w:tcPr>
+          <w:p>
+            <w:r>
+              <w:rPr>
+                <w:sz w:val="18"/>
+              </w:rPr>
+            </w:r>
+          </w:p>
+        </w:tc>
+      </w:tr>
+      <w:tr>
+        <w:trPr>
+          <w:cantSplit/>
+        </w:trPr>
+        <w:tc>
+          <w:tcPr>
+            <w:tcW w:type="dxa" w:w="567"/>
+          </w:tcPr>
+          <w:p>
+            <w:r>
+              <w:rPr>
+                <w:sz w:val="18"/>
+              </w:rPr>
+              <w:t>D16</w:t>
+            </w:r>
+          </w:p>
+        </w:tc>
+        <w:tc>
+          <w:tcPr>
+            <w:tcW w:type="dxa" w:w="3402"/>
+          </w:tcPr>
+          <w:p>
+            <w:r>
+              <w:rPr>
+                <w:sz w:val="18"/>
+              </w:rPr>
+              <w:t>¿Quién autoriza corregir una nota ya registrada?</w:t>
+            </w:r>
+          </w:p>
+        </w:tc>
+        <w:tc>
+          <w:tcPr>
+            <w:tcW w:type="dxa" w:w="5669"/>
+          </w:tcPr>
+          <w:p>
+            <w:r>
+              <w:rPr>
+                <w:sz w:val="18"/>
+              </w:rPr>
+              <w:t>El administrador. El profesor pide una solicitud de edición con motivo para uno o más estudiantes de una actividad; el administrador la aprueba o la rechaza con una observación. Cada estudiante aprobado habilita una sola corrección (con su motivo, US-04), que la usa en la misma transacción que la auditoría. No se pide en un trimestre cerrado.</w:t>
+            </w:r>
+          </w:p>
+        </w:tc>
+        <w:tc>
+          <w:tcPr>
+            <w:tcW w:type="dxa" w:w="1134"/>
+          </w:tcPr>
+          <w:p>
+            <w:r>
+              <w:rPr>
+                <w:sz w:val="18"/>
+              </w:rPr>
+              <w:t>☐</w:t>
+            </w:r>
+          </w:p>
+        </w:tc>
+        <w:tc>
+          <w:tcPr>
+            <w:tcW w:type="dxa" w:w="3118"/>
+          </w:tcPr>
+          <w:p>
+            <w:r>
+              <w:rPr>
+                <w:sz w:val="18"/>
+              </w:rPr>
+            </w:r>
+          </w:p>
+        </w:tc>
+      </w:tr>
+      <w:tr>
+        <w:trPr>
+          <w:cantSplit/>
+        </w:trPr>
+        <w:tc>
+          <w:tcPr>
+            <w:tcW w:type="dxa" w:w="567"/>
+          </w:tcPr>
+          <w:p>
+            <w:r>
+              <w:rPr>
+                <w:sz w:val="18"/>
+              </w:rPr>
+              <w:t>D17</w:t>
+            </w:r>
+          </w:p>
+        </w:tc>
+        <w:tc>
+          <w:tcPr>
+            <w:tcW w:type="dxa" w:w="3402"/>
+          </w:tcPr>
+          <w:p>
+            <w:r>
+              <w:rPr>
+                <w:sz w:val="18"/>
+              </w:rPr>
+              <w:t>¿Quién vincula a un padre con sus hijos y qué ve el padre?</w:t>
+            </w:r>
+          </w:p>
+        </w:tc>
+        <w:tc>
+          <w:tcPr>
+            <w:tcW w:type="dxa" w:w="5669"/>
+          </w:tcPr>
+          <w:p>
+            <w:r>
+              <w:rPr>
+                <w:sz w:val="18"/>
+              </w:rPr>
+              <w:t>La secretaria o el administrador vinculan una cuenta con rol PADRE y activa con uno o más estudiantes, con su parentesco (padre, madre, tutor legal, apoderado u otro; por defecto, padre). Un estudiante puede tener varios padres o tutores; el mismo vínculo no se repite. El vínculo se puede quitar, porque no es evidencia académica. Sin filtro, la lista muestra los vínculos de la gestión más reciente. El padre ve solo a sus hijos vinculados; si pide un estudiante no vinculado, o un ID que no existe, recibe 403 (así no se revela qué estudiantes hay).</w:t>
+            </w:r>
+          </w:p>
+        </w:tc>
+        <w:tc>
+          <w:tcPr>
+            <w:tcW w:type="dxa" w:w="1134"/>
+          </w:tcPr>
+          <w:p>
+            <w:r>
+              <w:rPr>
+                <w:sz w:val="18"/>
+              </w:rPr>
+              <w:t>☐</w:t>
+            </w:r>
+          </w:p>
+        </w:tc>
+        <w:tc>
+          <w:tcPr>
+            <w:tcW w:type="dxa" w:w="3118"/>
+          </w:tcPr>
+          <w:p>
+            <w:r>
+              <w:rPr>
+                <w:sz w:val="18"/>
+              </w:rPr>
+            </w:r>
+          </w:p>
+        </w:tc>
+      </w:tr>
+      <w:tr>
+        <w:trPr>
+          <w:cantSplit/>
+        </w:trPr>
+        <w:tc>
+          <w:tcPr>
+            <w:tcW w:type="dxa" w:w="567"/>
+          </w:tcPr>
+          <w:p>
+            <w:r>
+              <w:rPr>
+                <w:sz w:val="18"/>
+              </w:rPr>
+              <w:t>D18</w:t>
+            </w:r>
+          </w:p>
+        </w:tc>
+        <w:tc>
+          <w:tcPr>
+            <w:tcW w:type="dxa" w:w="3402"/>
+          </w:tcPr>
+          <w:p>
+            <w:r>
+              <w:rPr>
+                <w:sz w:val="18"/>
+              </w:rPr>
+              <w:t>¿Qué muestra el panel de riesgo y de qué periodo?</w:t>
+            </w:r>
+          </w:p>
+        </w:tc>
+        <w:tc>
+          <w:tcPr>
+            <w:tcW w:type="dxa" w:w="5669"/>
+          </w:tcPr>
+          <w:p>
+            <w:r>
+              <w:rPr>
+                <w:sz w:val="18"/>
+              </w:rPr>
+              <w:t>Por materia: la nota del trimestre de cada estudiante (US-02; pendiente si falta alguna dimensión) y su asistencia acumulada en la materia durante la gestión (US-19, D5). Si no se indica el trimestre, se usa el primero abierto de la gestión; si todos están cerrados, el último. En riesgo según D6; lo que todavía no tiene dato no cuenta, y sin nota ni asistencia el estudiante queda pendiente. Lo ven el profesor asignado a la materia, la secretaria y el administrador. Los promedios del resumen son indicadores con un decimal, no notas oficiales.</w:t>
+            </w:r>
+          </w:p>
+        </w:tc>
+        <w:tc>
+          <w:tcPr>
+            <w:tcW w:type="dxa" w:w="1134"/>
+          </w:tcPr>
+          <w:p>
+            <w:r>
+              <w:rPr>
+                <w:sz w:val="18"/>
+              </w:rPr>
+              <w:t>☐</w:t>
+            </w:r>
+          </w:p>
+        </w:tc>
+        <w:tc>
+          <w:tcPr>
+            <w:tcW w:type="dxa" w:w="3118"/>
+          </w:tcPr>
+          <w:p>
+            <w:r>
+              <w:rPr>
+                <w:sz w:val="18"/>
+              </w:rPr>
+            </w:r>
+          </w:p>
+        </w:tc>
+      </w:tr>
+      <w:tr>
+        <w:trPr>
+          <w:cantSplit/>
+        </w:trPr>
+        <w:tc>
+          <w:tcPr>
+            <w:tcW w:type="dxa" w:w="567"/>
+          </w:tcPr>
+          <w:p>
+            <w:r>
+              <w:rPr>
+                <w:sz w:val="18"/>
+              </w:rPr>
+              <w:t>D19</w:t>
+            </w:r>
+          </w:p>
+        </w:tc>
+        <w:tc>
+          <w:tcPr>
+            <w:tcW w:type="dxa" w:w="3402"/>
+          </w:tcPr>
+          <w:p>
+            <w:r>
+              <w:rPr>
+                <w:sz w:val="18"/>
+              </w:rPr>
+              <w:t>¿Qué lleva el boletín y cómo se generan los de un curso?</w:t>
+            </w:r>
+          </w:p>
+        </w:tc>
+        <w:tc>
+          <w:tcPr>
+            <w:tcW w:type="dxa" w:w="5669"/>
+          </w:tcPr>
+          <w:p>
+            <w:r>
+              <w:rPr>
+                <w:sz w:val="18"/>
+              </w:rPr>
+              <w:t>Una página por estudiante con la unidad educativa, el código SIE, la gestión, el nivel, el año de escolaridad y el paralelo; por materia, la nota de cada trimestre (US-02), la nota anual (D3, solo con los tres trimestres) y la asistencia acumulada (D5); al pie, los promedios del historial (D12). Lo pendiente se muestra con una raya. Lo generan el profesor que da clases al curso, la secretaria y el administrador. Los de un curso van a la cola BullMQ (ADR-0006) con cualquier tamaño; la pantalla la usa para los de más de 50. El aviso al terminar es el estado COMPLETADO del trabajo con su mensaje (el aviso por correo es de US-12). El PDF del curso se guarda 24 horas y solo lo descarga quien lo pidió.</w:t>
+            </w:r>
+          </w:p>
+        </w:tc>
+        <w:tc>
+          <w:tcPr>
+            <w:tcW w:type="dxa" w:w="1134"/>
+          </w:tcPr>
+          <w:p>
+            <w:r>
+              <w:rPr>
+                <w:sz w:val="18"/>
+              </w:rPr>
+              <w:t>☐</w:t>
+            </w:r>
+          </w:p>
+        </w:tc>
+        <w:tc>
+          <w:tcPr>
+            <w:tcW w:type="dxa" w:w="3118"/>
+          </w:tcPr>
+          <w:p>
+            <w:r>
+              <w:rPr>
+                <w:sz w:val="18"/>
+              </w:rPr>
+            </w:r>
+          </w:p>
+        </w:tc>
+      </w:tr>
+      <w:tr>
+        <w:trPr>
+          <w:cantSplit/>
+        </w:trPr>
+        <w:tc>
+          <w:tcPr>
+            <w:tcW w:type="dxa" w:w="567"/>
+          </w:tcPr>
+          <w:p>
+            <w:r>
+              <w:rPr>
+                <w:sz w:val="18"/>
+              </w:rPr>
+              <w:t>D20</w:t>
+            </w:r>
+          </w:p>
+        </w:tc>
+        <w:tc>
+          <w:tcPr>
+            <w:tcW w:type="dxa" w:w="3402"/>
+          </w:tcPr>
+          <w:p>
+            <w:r>
+              <w:rPr>
+                <w:sz w:val="18"/>
+              </w:rPr>
+              <w:t>¿Quién publica el boletín y qué ve el padre?</w:t>
+            </w:r>
+          </w:p>
+        </w:tc>
+        <w:tc>
+          <w:tcPr>
+            <w:tcW w:type="dxa" w:w="5669"/>
+          </w:tcPr>
+          <w:p>
+            <w:r>
+              <w:rPr>
+                <w:sz w:val="18"/>
+              </w:rPr>
+              <w:t>El boletín junta todas las materias del curso, así que no lo publica un profesor solo: lo publican la secretaria o el administrador, por curso y trimestre, y solo cuando todas las materias del curso entregaron sus notas de ese trimestre (US-10, D13); esa entrega es la del profesor que pide el criterio 2 de US-11. Se puede despublicar si fue un error. El padre ve solo a sus hijos vinculados (D17) y solo las notas de los trimestres publicados; la nota anual y el estado del año (promovido o retenido) aparecen cuando están publicados todos los trimestres. Sin ningún trimestre publicado, no ve ninguna nota y el PDF responde 404.</w:t>
             </w:r>
           </w:p>
         </w:tc>
@@ -2845,6 +4650,7 @@
               <w:rPr>
                 <w:sz w:val="20"/>
               </w:rPr>
+              <w:t>Fatima Carreño</w:t>
             </w:r>
           </w:p>
         </w:tc>
@@ -2857,7 +4663,7 @@
               <w:rPr>
                 <w:sz w:val="20"/>
               </w:rPr>
-              <w:t>Cliente: profesor(a) representante</w:t>
+              <w:t>Cliente: profesora representante</w:t>
             </w:r>
           </w:p>
         </w:tc>
@@ -2888,6 +4694,7 @@
               <w:rPr>
                 <w:sz w:val="20"/>
               </w:rPr>
+              <w:t>Fabiana Parrado</w:t>
             </w:r>
           </w:p>
         </w:tc>
@@ -2900,7 +4707,7 @@
               <w:rPr>
                 <w:sz w:val="20"/>
               </w:rPr>
-              <w:t>Cliente: dirección o secretaría</w:t>
+              <w:t>Cliente: directora</w:t>
             </w:r>
           </w:p>
         </w:tc>

</xml_diff>